<commit_message>
Align budget monitoring with the government fiscal year and the current request process.
Charts run from 1 October to 30 September, material lines can be loaded from Excel, and the status page shows cumulative request amounts.

Co-authored-by: Cursor <cursoragent@cursor.com>
</commit_message>
<xml_diff>
--- a/docs/คู่มือการใช้งาน-ระบบงบประมาณ.docx
+++ b/docs/คู่มือการใช้งาน-ระบบงบประมาณ.docx
@@ -326,7 +326,7 @@
                 <w:color w:val="2A333A"/>
                 <w:sz w:val="22"/>
               </w:rPr>
-              <w:t>1.0</w:t>
+              <w:t>1.1</w:t>
             </w:r>
           </w:p>
         </w:tc>
@@ -394,7 +394,7 @@
                 <w:color w:val="2A333A"/>
                 <w:sz w:val="22"/>
               </w:rPr>
-              <w:t>24 สิงหาคม พ.ศ. 2569</w:t>
+              <w:t>5 ตุลาคม พ.ศ. 2569</w:t>
             </w:r>
           </w:p>
         </w:tc>
@@ -462,7 +462,7 @@
                 <w:color w:val="2A333A"/>
                 <w:sz w:val="22"/>
               </w:rPr>
-              <w:t>ฉบับส่งมอบ (Released)</w:t>
+              <w:t>ฉบับปรับปรุง</w:t>
             </w:r>
           </w:p>
         </w:tc>
@@ -943,6 +943,140 @@
           <w:tcPr>
             <w:tcW w:type="dxa" w:w="1928"/>
             <w:shd w:val="clear" w:color="auto" w:fill="FFFFFF"/>
+            <w:tcBorders>
+              <w:top w:val="single" w:sz="4" w:space="0" w:color="D7DEE6"/>
+              <w:left w:val="single" w:sz="4" w:space="0" w:color="D7DEE6"/>
+              <w:bottom w:val="single" w:sz="4" w:space="0" w:color="D7DEE6"/>
+              <w:right w:val="single" w:sz="4" w:space="0" w:color="D7DEE6"/>
+            </w:tcBorders>
+            <w:tcMar>
+              <w:top w:w="80" w:type="dxa"/>
+              <w:left w:w="80" w:type="dxa"/>
+              <w:bottom w:w="80" w:type="dxa"/>
+              <w:right w:w="80" w:type="dxa"/>
+            </w:tcMar>
+          </w:tcPr>
+          <w:p>
+            <w:pPr>
+              <w:spacing w:before="40" w:after="40"/>
+              <w:jc w:val="left"/>
+            </w:pPr>
+            <w:r>
+              <w:rPr>
+                <w:rFonts w:ascii="Prompt" w:hAnsi="Prompt" w:eastAsia="Prompt" w:cs="Prompt"/>
+                <w:b w:val="0"/>
+                <w:color w:val="2A333A"/>
+                <w:sz w:val="22"/>
+              </w:rPr>
+              <w:t>ทีมพัฒนาระบบ ERP</w:t>
+            </w:r>
+          </w:p>
+        </w:tc>
+      </w:tr>
+      <w:tr>
+        <w:tc>
+          <w:tcPr>
+            <w:tcW w:type="dxa" w:w="1361"/>
+            <w:shd w:val="clear" w:color="auto" w:fill="F6F8FA"/>
+            <w:tcBorders>
+              <w:top w:val="single" w:sz="4" w:space="0" w:color="D7DEE6"/>
+              <w:left w:val="single" w:sz="4" w:space="0" w:color="D7DEE6"/>
+              <w:bottom w:val="single" w:sz="4" w:space="0" w:color="D7DEE6"/>
+              <w:right w:val="single" w:sz="4" w:space="0" w:color="D7DEE6"/>
+            </w:tcBorders>
+            <w:tcMar>
+              <w:top w:w="80" w:type="dxa"/>
+              <w:left w:w="80" w:type="dxa"/>
+              <w:bottom w:w="80" w:type="dxa"/>
+              <w:right w:w="80" w:type="dxa"/>
+            </w:tcMar>
+          </w:tcPr>
+          <w:p>
+            <w:pPr>
+              <w:spacing w:before="40" w:after="40"/>
+              <w:jc w:val="left"/>
+            </w:pPr>
+            <w:r>
+              <w:rPr>
+                <w:rFonts w:ascii="Prompt" w:hAnsi="Prompt" w:eastAsia="Prompt" w:cs="Prompt"/>
+                <w:b w:val="0"/>
+                <w:color w:val="2A333A"/>
+                <w:sz w:val="22"/>
+              </w:rPr>
+              <w:t>1.1</w:t>
+            </w:r>
+          </w:p>
+        </w:tc>
+        <w:tc>
+          <w:tcPr>
+            <w:tcW w:type="dxa" w:w="1701"/>
+            <w:shd w:val="clear" w:color="auto" w:fill="F6F8FA"/>
+            <w:tcBorders>
+              <w:top w:val="single" w:sz="4" w:space="0" w:color="D7DEE6"/>
+              <w:left w:val="single" w:sz="4" w:space="0" w:color="D7DEE6"/>
+              <w:bottom w:val="single" w:sz="4" w:space="0" w:color="D7DEE6"/>
+              <w:right w:val="single" w:sz="4" w:space="0" w:color="D7DEE6"/>
+            </w:tcBorders>
+            <w:tcMar>
+              <w:top w:w="80" w:type="dxa"/>
+              <w:left w:w="80" w:type="dxa"/>
+              <w:bottom w:w="80" w:type="dxa"/>
+              <w:right w:w="80" w:type="dxa"/>
+            </w:tcMar>
+          </w:tcPr>
+          <w:p>
+            <w:pPr>
+              <w:spacing w:before="40" w:after="40"/>
+              <w:jc w:val="left"/>
+            </w:pPr>
+            <w:r>
+              <w:rPr>
+                <w:rFonts w:ascii="Prompt" w:hAnsi="Prompt" w:eastAsia="Prompt" w:cs="Prompt"/>
+                <w:b w:val="0"/>
+                <w:color w:val="2A333A"/>
+                <w:sz w:val="22"/>
+              </w:rPr>
+              <w:t>5 ต.ค. 2569</w:t>
+            </w:r>
+          </w:p>
+        </w:tc>
+        <w:tc>
+          <w:tcPr>
+            <w:tcW w:type="dxa" w:w="4195"/>
+            <w:shd w:val="clear" w:color="auto" w:fill="F6F8FA"/>
+            <w:tcBorders>
+              <w:top w:val="single" w:sz="4" w:space="0" w:color="D7DEE6"/>
+              <w:left w:val="single" w:sz="4" w:space="0" w:color="D7DEE6"/>
+              <w:bottom w:val="single" w:sz="4" w:space="0" w:color="D7DEE6"/>
+              <w:right w:val="single" w:sz="4" w:space="0" w:color="D7DEE6"/>
+            </w:tcBorders>
+            <w:tcMar>
+              <w:top w:w="80" w:type="dxa"/>
+              <w:left w:w="80" w:type="dxa"/>
+              <w:bottom w:w="80" w:type="dxa"/>
+              <w:right w:w="80" w:type="dxa"/>
+            </w:tcMar>
+          </w:tcPr>
+          <w:p>
+            <w:pPr>
+              <w:spacing w:before="40" w:after="40"/>
+              <w:jc w:val="left"/>
+            </w:pPr>
+            <w:r>
+              <w:rPr>
+                <w:rFonts w:ascii="Prompt" w:hAnsi="Prompt" w:eastAsia="Prompt" w:cs="Prompt"/>
+                <w:b w:val="0"/>
+                <w:color w:val="2A333A"/>
+                <w:sz w:val="22"/>
+              </w:rPr>
+              <w:t>ปรับชื่อเมนูและสถานะให้ตรงหน้าจอปัจจุบัน และใส่ภาพหน้าจอขั้นตอนการทำรายการ</w:t>
+            </w:r>
+          </w:p>
+        </w:tc>
+        <w:tc>
+          <w:tcPr>
+            <w:tcW w:type="dxa" w:w="1928"/>
+            <w:shd w:val="clear" w:color="auto" w:fill="F6F8FA"/>
             <w:tcBorders>
               <w:top w:val="single" w:sz="4" w:space="0" w:color="D7DEE6"/>
               <w:left w:val="single" w:sz="4" w:space="0" w:color="D7DEE6"/>
@@ -3067,7 +3201,7 @@
       <w:r>
         <w:drawing>
           <wp:inline xmlns:a="http://schemas.openxmlformats.org/drawingml/2006/main" xmlns:pic="http://schemas.openxmlformats.org/drawingml/2006/picture">
-            <wp:extent cx="5832000" cy="2624400"/>
+            <wp:extent cx="2304000" cy="5841127"/>
             <wp:docPr id="7" name="Picture 7"/>
             <wp:cNvGraphicFramePr>
               <a:graphicFrameLocks noChangeAspect="1"/>
@@ -3076,7 +3210,7 @@
               <a:graphicData uri="http://schemas.openxmlformats.org/drawingml/2006/picture">
                 <pic:pic>
                   <pic:nvPicPr>
-                    <pic:cNvPr id="0" name="fig_menus.png"/>
+                    <pic:cNvPr id="0" name="Screenshot_bud_menu.png"/>
                     <pic:cNvPicPr/>
                   </pic:nvPicPr>
                   <pic:blipFill>
@@ -3088,7 +3222,7 @@
                   <pic:spPr>
                     <a:xfrm>
                       <a:off x="0" y="0"/>
-                      <a:ext cx="5832000" cy="2624400"/>
+                      <a:ext cx="2304000" cy="5841127"/>
                     </a:xfrm>
                     <a:prstGeom prst="rect"/>
                   </pic:spPr>
@@ -3111,7 +3245,7 @@
           <w:color w:val="7D8A9E"/>
           <w:sz w:val="20"/>
         </w:rPr>
-        <w:t>▲ ภาพที่ 6  แผนที่เมนูแอปงบประมาณ</w:t>
+        <w:t>▲ ภาพที่ 6  เมนูงบประมาณของหน่วยงบประมาณ</w:t>
       </w:r>
     </w:p>
     <w:p>
@@ -3742,7 +3876,7 @@
                 <w:color w:val="2A333A"/>
                 <w:sz w:val="22"/>
               </w:rPr>
-              <w:t>ดูสถานะคำขอ ภาพรวมรายปี และรายแผนก</w:t>
+              <w:t>ติดตามงบประมาณประจำปี บริการงบประมาณรายแผนก และสถานะคำของบประมาณ</w:t>
             </w:r>
           </w:p>
         </w:tc>
@@ -3922,6 +4056,61 @@
     </w:p>
     <w:p>
       <w:pPr>
+        <w:spacing w:after="40"/>
+        <w:jc w:val="center"/>
+      </w:pPr>
+      <w:r>
+        <w:drawing>
+          <wp:inline xmlns:a="http://schemas.openxmlformats.org/drawingml/2006/main" xmlns:pic="http://schemas.openxmlformats.org/drawingml/2006/picture">
+            <wp:extent cx="5832000" cy="1006343"/>
+            <wp:docPr id="8" name="Picture 8"/>
+            <wp:cNvGraphicFramePr>
+              <a:graphicFrameLocks noChangeAspect="1"/>
+            </wp:cNvGraphicFramePr>
+            <a:graphic>
+              <a:graphicData uri="http://schemas.openxmlformats.org/drawingml/2006/picture">
+                <pic:pic>
+                  <pic:nvPicPr>
+                    <pic:cNvPr id="0" name="Screenshot_bud_request_list.png"/>
+                    <pic:cNvPicPr/>
+                  </pic:nvPicPr>
+                  <pic:blipFill>
+                    <a:blip r:embed="rId18"/>
+                    <a:stretch>
+                      <a:fillRect/>
+                    </a:stretch>
+                  </pic:blipFill>
+                  <pic:spPr>
+                    <a:xfrm>
+                      <a:off x="0" y="0"/>
+                      <a:ext cx="5832000" cy="1006343"/>
+                    </a:xfrm>
+                    <a:prstGeom prst="rect"/>
+                  </pic:spPr>
+                </pic:pic>
+              </a:graphicData>
+            </a:graphic>
+          </wp:inline>
+        </w:drawing>
+      </w:r>
+    </w:p>
+    <w:p>
+      <w:pPr>
+        <w:spacing w:before="80" w:after="240"/>
+        <w:jc w:val="left"/>
+      </w:pPr>
+      <w:r>
+        <w:rPr>
+          <w:rFonts w:ascii="Prompt" w:hAnsi="Prompt" w:eastAsia="Prompt" w:cs="Prompt"/>
+          <w:b w:val="0"/>
+          <w:color w:val="7D8A9E"/>
+          <w:sz w:val="20"/>
+        </w:rPr>
+        <w:t>▲ ภาพที่ 7  รายการคำของบ ใบ DBR/2026/0008 สถานะอนุมัติแล้ว</w:t>
+      </w:r>
+    </w:p>
+    <w:p>
+      <w:pPr>
         <w:spacing w:after="80"/>
       </w:pPr>
       <w:r>
@@ -3991,6 +4180,61 @@
     </w:p>
     <w:p>
       <w:pPr>
+        <w:spacing w:after="40"/>
+        <w:jc w:val="center"/>
+      </w:pPr>
+      <w:r>
+        <w:drawing>
+          <wp:inline xmlns:a="http://schemas.openxmlformats.org/drawingml/2006/main" xmlns:pic="http://schemas.openxmlformats.org/drawingml/2006/picture">
+            <wp:extent cx="5832000" cy="2971109"/>
+            <wp:docPr id="9" name="Picture 9"/>
+            <wp:cNvGraphicFramePr>
+              <a:graphicFrameLocks noChangeAspect="1"/>
+            </wp:cNvGraphicFramePr>
+            <a:graphic>
+              <a:graphicData uri="http://schemas.openxmlformats.org/drawingml/2006/picture">
+                <pic:pic>
+                  <pic:nvPicPr>
+                    <pic:cNvPr id="0" name="Screenshot_bud_request_form.png"/>
+                    <pic:cNvPicPr/>
+                  </pic:nvPicPr>
+                  <pic:blipFill>
+                    <a:blip r:embed="rId19"/>
+                    <a:stretch>
+                      <a:fillRect/>
+                    </a:stretch>
+                  </pic:blipFill>
+                  <pic:spPr>
+                    <a:xfrm>
+                      <a:off x="0" y="0"/>
+                      <a:ext cx="5832000" cy="2971109"/>
+                    </a:xfrm>
+                    <a:prstGeom prst="rect"/>
+                  </pic:spPr>
+                </pic:pic>
+              </a:graphicData>
+            </a:graphic>
+          </wp:inline>
+        </w:drawing>
+      </w:r>
+    </w:p>
+    <w:p>
+      <w:pPr>
+        <w:spacing w:before="80" w:after="240"/>
+        <w:jc w:val="left"/>
+      </w:pPr>
+      <w:r>
+        <w:rPr>
+          <w:rFonts w:ascii="Prompt" w:hAnsi="Prompt" w:eastAsia="Prompt" w:cs="Prompt"/>
+          <w:b w:val="0"/>
+          <w:color w:val="7D8A9E"/>
+          <w:sz w:val="20"/>
+        </w:rPr>
+        <w:t>▲ ภาพที่ 8  หัวใบคำของบวัสดุ เลือกหน่วยงาน ปีงบประมาณ แหล่งเงิน แบบฟอร์ม และตรวจยอดที่ขอ</w:t>
+      </w:r>
+    </w:p>
+    <w:p>
+      <w:pPr>
         <w:spacing w:after="80"/>
       </w:pPr>
       <w:r>
@@ -4032,7 +4276,62 @@
           <w:color w:val="2A333A"/>
           <w:sz w:val="24"/>
         </w:rPr>
-        <w:t>เพิ่มบรรทัดรายการ หมวดงบ กลุ่มวัสดุ ประเภทวัสดุย่อย และยอดที่ขอ</w:t>
+        <w:t>เพิ่มบรรทัดรายการ หมวดงบ กลุ่มวัสดุ ประเภทวัสดุ และยอดคำขอตั้งแผนปีงบ</w:t>
+      </w:r>
+    </w:p>
+    <w:p>
+      <w:pPr>
+        <w:spacing w:after="40"/>
+        <w:jc w:val="center"/>
+      </w:pPr>
+      <w:r>
+        <w:drawing>
+          <wp:inline xmlns:a="http://schemas.openxmlformats.org/drawingml/2006/main" xmlns:pic="http://schemas.openxmlformats.org/drawingml/2006/picture">
+            <wp:extent cx="5832000" cy="2659622"/>
+            <wp:docPr id="10" name="Picture 10"/>
+            <wp:cNvGraphicFramePr>
+              <a:graphicFrameLocks noChangeAspect="1"/>
+            </wp:cNvGraphicFramePr>
+            <a:graphic>
+              <a:graphicData uri="http://schemas.openxmlformats.org/drawingml/2006/picture">
+                <pic:pic>
+                  <pic:nvPicPr>
+                    <pic:cNvPr id="0" name="Screenshot_bud_request_summary.png"/>
+                    <pic:cNvPicPr/>
+                  </pic:nvPicPr>
+                  <pic:blipFill>
+                    <a:blip r:embed="rId20"/>
+                    <a:stretch>
+                      <a:fillRect/>
+                    </a:stretch>
+                  </pic:blipFill>
+                  <pic:spPr>
+                    <a:xfrm>
+                      <a:off x="0" y="0"/>
+                      <a:ext cx="5832000" cy="2659622"/>
+                    </a:xfrm>
+                    <a:prstGeom prst="rect"/>
+                  </pic:spPr>
+                </pic:pic>
+              </a:graphicData>
+            </a:graphic>
+          </wp:inline>
+        </w:drawing>
+      </w:r>
+    </w:p>
+    <w:p>
+      <w:pPr>
+        <w:spacing w:before="80" w:after="240"/>
+        <w:jc w:val="left"/>
+      </w:pPr>
+      <w:r>
+        <w:rPr>
+          <w:rFonts w:ascii="Prompt" w:hAnsi="Prompt" w:eastAsia="Prompt" w:cs="Prompt"/>
+          <w:b w:val="0"/>
+          <w:color w:val="7D8A9E"/>
+          <w:sz w:val="20"/>
+        </w:rPr>
+        <w:t>▲ ภาพที่ 9  แท็บแบบตั้งงบภาพรวม ยอดคำขอตั้งแผนปีงบ และเหตุผลประกอบคำขอตั้ง</w:t>
       </w:r>
     </w:p>
     <w:p>
@@ -4055,7 +4354,62 @@
           <w:color w:val="2A333A"/>
           <w:sz w:val="24"/>
         </w:rPr>
-        <w:t>ถ้าเป็นงบวัสดุ ให้เปิดแท็บรายละเอียดสินค้า แล้วใส่รายการสินค้าให้ครบ</w:t>
+        <w:t>ถ้าเป็นงบวัสดุ ให้เปิดแท็บรายการวัสดุ แล้วใส่รายการสินค้า หน่วยนับ ปริมาณ ราคา ให้ครบ</w:t>
+      </w:r>
+    </w:p>
+    <w:p>
+      <w:pPr>
+        <w:spacing w:after="40"/>
+        <w:jc w:val="center"/>
+      </w:pPr>
+      <w:r>
+        <w:drawing>
+          <wp:inline xmlns:a="http://schemas.openxmlformats.org/drawingml/2006/main" xmlns:pic="http://schemas.openxmlformats.org/drawingml/2006/picture">
+            <wp:extent cx="5832000" cy="4121216"/>
+            <wp:docPr id="11" name="Picture 11"/>
+            <wp:cNvGraphicFramePr>
+              <a:graphicFrameLocks noChangeAspect="1"/>
+            </wp:cNvGraphicFramePr>
+            <a:graphic>
+              <a:graphicData uri="http://schemas.openxmlformats.org/drawingml/2006/picture">
+                <pic:pic>
+                  <pic:nvPicPr>
+                    <pic:cNvPr id="0" name="Screenshot_bud_request_lines.png"/>
+                    <pic:cNvPicPr/>
+                  </pic:nvPicPr>
+                  <pic:blipFill>
+                    <a:blip r:embed="rId21"/>
+                    <a:stretch>
+                      <a:fillRect/>
+                    </a:stretch>
+                  </pic:blipFill>
+                  <pic:spPr>
+                    <a:xfrm>
+                      <a:off x="0" y="0"/>
+                      <a:ext cx="5832000" cy="4121216"/>
+                    </a:xfrm>
+                    <a:prstGeom prst="rect"/>
+                  </pic:spPr>
+                </pic:pic>
+              </a:graphicData>
+            </a:graphic>
+          </wp:inline>
+        </w:drawing>
+      </w:r>
+    </w:p>
+    <w:p>
+      <w:pPr>
+        <w:spacing w:before="80" w:after="240"/>
+        <w:jc w:val="left"/>
+      </w:pPr>
+      <w:r>
+        <w:rPr>
+          <w:rFonts w:ascii="Prompt" w:hAnsi="Prompt" w:eastAsia="Prompt" w:cs="Prompt"/>
+          <w:b w:val="0"/>
+          <w:color w:val="7D8A9E"/>
+          <w:sz w:val="20"/>
+        </w:rPr>
+        <w:t>▲ ภาพที่ 10  แท็บรายการวัสดุ ใส่รายการสินค้า หน่วยนับ ปริมาณที่ขอ ราคา และมูลค่าที่ของบ</w:t>
       </w:r>
     </w:p>
     <w:p>
@@ -4078,62 +4432,7 @@
           <w:color w:val="2A333A"/>
           <w:sz w:val="24"/>
         </w:rPr>
-        <w:t>ตรวจยอดงบประมาณที่ขอที่หัวใบ ว่ารวมจากบรรทัดถูกต้อง แล้วบันทึก</w:t>
-      </w:r>
-    </w:p>
-    <w:p>
-      <w:pPr>
-        <w:spacing w:after="40"/>
-        <w:jc w:val="center"/>
-      </w:pPr>
-      <w:r>
-        <w:drawing>
-          <wp:inline xmlns:a="http://schemas.openxmlformats.org/drawingml/2006/main" xmlns:pic="http://schemas.openxmlformats.org/drawingml/2006/picture">
-            <wp:extent cx="5832000" cy="3280500"/>
-            <wp:docPr id="8" name="Picture 8"/>
-            <wp:cNvGraphicFramePr>
-              <a:graphicFrameLocks noChangeAspect="1"/>
-            </wp:cNvGraphicFramePr>
-            <a:graphic>
-              <a:graphicData uri="http://schemas.openxmlformats.org/drawingml/2006/picture">
-                <pic:pic>
-                  <pic:nvPicPr>
-                    <pic:cNvPr id="0" name="fig_request_form.png"/>
-                    <pic:cNvPicPr/>
-                  </pic:nvPicPr>
-                  <pic:blipFill>
-                    <a:blip r:embed="rId18"/>
-                    <a:stretch>
-                      <a:fillRect/>
-                    </a:stretch>
-                  </pic:blipFill>
-                  <pic:spPr>
-                    <a:xfrm>
-                      <a:off x="0" y="0"/>
-                      <a:ext cx="5832000" cy="3280500"/>
-                    </a:xfrm>
-                    <a:prstGeom prst="rect"/>
-                  </pic:spPr>
-                </pic:pic>
-              </a:graphicData>
-            </a:graphic>
-          </wp:inline>
-        </w:drawing>
-      </w:r>
-    </w:p>
-    <w:p>
-      <w:pPr>
-        <w:spacing w:before="80" w:after="240"/>
-        <w:jc w:val="left"/>
-      </w:pPr>
-      <w:r>
-        <w:rPr>
-          <w:rFonts w:ascii="Prompt" w:hAnsi="Prompt" w:eastAsia="Prompt" w:cs="Prompt"/>
-          <w:b w:val="0"/>
-          <w:color w:val="7D8A9E"/>
-          <w:sz w:val="20"/>
-        </w:rPr>
-        <w:t>▲ ภาพที่ 7  หน้าจอคำของบวัสดุขณะยังเป็นร่าง</w:t>
+        <w:t>ตรวจยอดงบประมาณที่ขอที่หัวใบ และยอดรวมในแท็บแบบตั้งงบภาพรวม แล้วบันทึก</w:t>
       </w:r>
     </w:p>
     <w:p>
@@ -4162,7 +4461,7 @@
           <w:color w:val="2A333A"/>
           <w:sz w:val="24"/>
         </w:rPr>
-        <w:t>เมื่อกรอกครบแล้ว กดปุ่ม ส่งใบคำขอ ที่แถบหัวเอกสาร สถานะจะเปลี่ยนจาก ร่าง เป็น ส่งงานงบ</w:t>
+        <w:t>เมื่อกรอกครบแล้ว กดปุ่ม ส่งใบคำขอ ที่แถบหัวเอกสาร สถานะบนแถบจะเปลี่ยนจาก แบบร่าง เป็น ส่งหน่วยงบประมาณ ปุ่ม ส่งใบคำขอ เห็นเฉพาะตอนใบยังเป็นแบบร่าง</w:t>
       </w:r>
     </w:p>
     <w:tbl>
@@ -4376,7 +4675,7 @@
                 <w:color w:val="2A333A"/>
                 <w:sz w:val="22"/>
               </w:rPr>
-              <w:t>ร่าง</w:t>
+              <w:t>แบบร่าง</w:t>
             </w:r>
           </w:p>
         </w:tc>
@@ -4409,7 +4708,7 @@
                 <w:color w:val="2A333A"/>
                 <w:sz w:val="22"/>
               </w:rPr>
-              <w:t>แก้รายการ ลบใบ บันทึก และส่ง</w:t>
+              <w:t>แก้รายการ ลบใบ บันทึก และกดส่งใบคำขอ</w:t>
             </w:r>
           </w:p>
         </w:tc>
@@ -4477,7 +4776,7 @@
                 <w:color w:val="2A333A"/>
                 <w:sz w:val="22"/>
               </w:rPr>
-              <w:t>ส่งงานงบ / รับเรื่อง / พิจารณา</w:t>
+              <w:t>ส่งหน่วยงบประมาณ / รับเรื่องแล้ว / อยู่ระหว่างพิจารณา</w:t>
             </w:r>
           </w:p>
         </w:tc>
@@ -4578,7 +4877,7 @@
                 <w:color w:val="2A333A"/>
                 <w:sz w:val="22"/>
               </w:rPr>
-              <w:t>อนุมัติ</w:t>
+              <w:t>อนุมัติแล้ว</w:t>
             </w:r>
           </w:p>
         </w:tc>
@@ -4679,7 +4978,7 @@
                 <w:color w:val="2A333A"/>
                 <w:sz w:val="22"/>
               </w:rPr>
-              <w:t>ตีกลับ</w:t>
+              <w:t>ไม่อนุมัติ</w:t>
             </w:r>
           </w:p>
         </w:tc>
@@ -4793,7 +5092,7 @@
         <w:drawing>
           <wp:inline xmlns:a="http://schemas.openxmlformats.org/drawingml/2006/main" xmlns:pic="http://schemas.openxmlformats.org/drawingml/2006/picture">
             <wp:extent cx="5832000" cy="2259900"/>
-            <wp:docPr id="9" name="Picture 9"/>
+            <wp:docPr id="12" name="Picture 12"/>
             <wp:cNvGraphicFramePr>
               <a:graphicFrameLocks noChangeAspect="1"/>
             </wp:cNvGraphicFramePr>
@@ -4805,7 +5104,7 @@
                     <pic:cNvPicPr/>
                   </pic:nvPicPr>
                   <pic:blipFill>
-                    <a:blip r:embed="rId19"/>
+                    <a:blip r:embed="rId22"/>
                     <a:stretch>
                       <a:fillRect/>
                     </a:stretch>
@@ -4836,7 +5135,7 @@
           <w:color w:val="7D8A9E"/>
           <w:sz w:val="20"/>
         </w:rPr>
-        <w:t>▲ ภาพที่ 8  สถานะคำของบและปุ่มที่งานงบต้องกด</w:t>
+        <w:t>▲ ภาพที่ 11  สถานะคำของบและปุ่มที่งานงบต้องกด</w:t>
       </w:r>
     </w:p>
     <w:p>
@@ -5097,7 +5396,7 @@
                 <w:color w:val="2A333A"/>
                 <w:sz w:val="22"/>
               </w:rPr>
-              <w:t>สถานะ ส่งงานงบ</w:t>
+              <w:t>สถานะ ส่งหน่วยงบประมาณ</w:t>
             </w:r>
           </w:p>
         </w:tc>
@@ -5130,7 +5429,7 @@
                 <w:color w:val="2A333A"/>
                 <w:sz w:val="22"/>
               </w:rPr>
-              <w:t>ยืนยันว่าเอกสารเข้าคิวงานงบแล้ว</w:t>
+              <w:t>แถบสถานะเป็น รับเรื่องแล้ว</w:t>
             </w:r>
           </w:p>
         </w:tc>
@@ -5231,7 +5530,7 @@
                 <w:color w:val="2A333A"/>
                 <w:sz w:val="22"/>
               </w:rPr>
-              <w:t>สถานะ รับเรื่อง</w:t>
+              <w:t>สถานะ รับเรื่องแล้ว</w:t>
             </w:r>
           </w:p>
         </w:tc>
@@ -5264,7 +5563,7 @@
                 <w:color w:val="2A333A"/>
                 <w:sz w:val="22"/>
               </w:rPr>
-              <w:t>เริ่มตรวจรายการและใส่ยอดจัดสรรได้</w:t>
+              <w:t>แถบสถานะเป็น อยู่ระหว่างพิจารณา</w:t>
             </w:r>
           </w:p>
         </w:tc>
@@ -5365,7 +5664,7 @@
                 <w:color w:val="2A333A"/>
                 <w:sz w:val="22"/>
               </w:rPr>
-              <w:t>สถานะ พิจารณา และใส่ยอดจัดสรรครบ</w:t>
+              <w:t>อยู่ระหว่างพิจารณา และใส่ยอดจัดสรรครบ</w:t>
             </w:r>
           </w:p>
         </w:tc>
@@ -5398,7 +5697,7 @@
                 <w:color w:val="2A333A"/>
                 <w:sz w:val="22"/>
               </w:rPr>
-              <w:t>ยอดเข้าแผนประจำปี ใช้จ่ายได้</w:t>
+              <w:t>แถบสถานะเป็น อนุมัติแล้ว ยอดเข้าแผนประจำปี</w:t>
             </w:r>
           </w:p>
         </w:tc>
@@ -5532,7 +5831,7 @@
                 <w:color w:val="2A333A"/>
                 <w:sz w:val="22"/>
               </w:rPr>
-              <w:t>คืนหน่วยงานให้แก้ ใบนี้ยังไม่เข้าแผน</w:t>
+              <w:t>แถบสถานะเป็น ไม่อนุมัติ คืนหน่วยงานให้แก้</w:t>
             </w:r>
           </w:p>
         </w:tc>
@@ -5886,7 +6185,7 @@
         <w:drawing>
           <wp:inline xmlns:a="http://schemas.openxmlformats.org/drawingml/2006/main" xmlns:pic="http://schemas.openxmlformats.org/drawingml/2006/picture">
             <wp:extent cx="5832000" cy="2332800"/>
-            <wp:docPr id="10" name="Picture 10"/>
+            <wp:docPr id="13" name="Picture 13"/>
             <wp:cNvGraphicFramePr>
               <a:graphicFrameLocks noChangeAspect="1"/>
             </wp:cNvGraphicFramePr>
@@ -5898,7 +6197,7 @@
                     <pic:cNvPicPr/>
                   </pic:nvPicPr>
                   <pic:blipFill>
-                    <a:blip r:embed="rId20"/>
+                    <a:blip r:embed="rId23"/>
                     <a:stretch>
                       <a:fillRect/>
                     </a:stretch>
@@ -5929,7 +6228,7 @@
           <w:color w:val="7D8A9E"/>
           <w:sz w:val="20"/>
         </w:rPr>
-        <w:t>▲ ภาพที่ 9  ลำดับใช้งบจาก PR ถึงใบตั้งเจ้าหนี้</w:t>
+        <w:t>▲ ภาพที่ 12  ลำดับใช้งบจาก PR ถึงใบตั้งเจ้าหนี้</w:t>
       </w:r>
     </w:p>
     <w:p>
@@ -6122,8 +6421,8 @@
       <w:r>
         <w:drawing>
           <wp:inline xmlns:a="http://schemas.openxmlformats.org/drawingml/2006/main" xmlns:pic="http://schemas.openxmlformats.org/drawingml/2006/picture">
-            <wp:extent cx="5832000" cy="3134700"/>
-            <wp:docPr id="11" name="Picture 11"/>
+            <wp:extent cx="5832000" cy="1298327"/>
+            <wp:docPr id="14" name="Picture 14"/>
             <wp:cNvGraphicFramePr>
               <a:graphicFrameLocks noChangeAspect="1"/>
             </wp:cNvGraphicFramePr>
@@ -6131,11 +6430,11 @@
               <a:graphicData uri="http://schemas.openxmlformats.org/drawingml/2006/picture">
                 <pic:pic>
                   <pic:nvPicPr>
-                    <pic:cNvPr id="0" name="fig_pr_check.png"/>
+                    <pic:cNvPr id="0" name="Screenshot_TAB_budget_enough.png"/>
                     <pic:cNvPicPr/>
                   </pic:nvPicPr>
                   <pic:blipFill>
-                    <a:blip r:embed="rId21"/>
+                    <a:blip r:embed="rId24"/>
                     <a:stretch>
                       <a:fillRect/>
                     </a:stretch>
@@ -6143,7 +6442,7 @@
                   <pic:spPr>
                     <a:xfrm>
                       <a:off x="0" y="0"/>
-                      <a:ext cx="5832000" cy="3134700"/>
+                      <a:ext cx="5832000" cy="1298327"/>
                     </a:xfrm>
                     <a:prstGeom prst="rect"/>
                   </pic:spPr>
@@ -6166,7 +6465,7 @@
           <w:color w:val="7D8A9E"/>
           <w:sz w:val="20"/>
         </w:rPr>
-        <w:t>▲ ภาพที่ 10  แท็บตรวจสอบงบประมาณบนใบขอซื้อ</w:t>
+        <w:t>▲ ภาพที่ 13  แท็บตรวจสอบงบประมาณบนใบขอซื้อ ผลเป็นงบเพียงพอ และระบบจองงบแล้ว</w:t>
       </w:r>
     </w:p>
     <w:tbl>
@@ -6399,7 +6698,7 @@
         <w:drawing>
           <wp:inline xmlns:a="http://schemas.openxmlformats.org/drawingml/2006/main" xmlns:pic="http://schemas.openxmlformats.org/drawingml/2006/picture">
             <wp:extent cx="5832000" cy="2259900"/>
-            <wp:docPr id="12" name="Picture 12"/>
+            <wp:docPr id="15" name="Picture 15"/>
             <wp:cNvGraphicFramePr>
               <a:graphicFrameLocks noChangeAspect="1"/>
             </wp:cNvGraphicFramePr>
@@ -6411,7 +6710,7 @@
                     <pic:cNvPicPr/>
                   </pic:nvPicPr>
                   <pic:blipFill>
-                    <a:blip r:embed="rId22"/>
+                    <a:blip r:embed="rId25"/>
                     <a:stretch>
                       <a:fillRect/>
                     </a:stretch>
@@ -6442,7 +6741,7 @@
           <w:color w:val="7D8A9E"/>
           <w:sz w:val="20"/>
         </w:rPr>
-        <w:t>▲ ภาพที่ 11  สูตรคงเหลือและตัวอย่างชุดอบรม</w:t>
+        <w:t>▲ ภาพที่ 14  สูตรคงเหลือและตัวอย่างชุดอบรม</w:t>
       </w:r>
     </w:p>
     <w:tbl>
@@ -8335,7 +8634,7 @@
         <w:drawing>
           <wp:inline xmlns:a="http://schemas.openxmlformats.org/drawingml/2006/main" xmlns:pic="http://schemas.openxmlformats.org/drawingml/2006/picture">
             <wp:extent cx="5832000" cy="2259900"/>
-            <wp:docPr id="13" name="Picture 13"/>
+            <wp:docPr id="16" name="Picture 16"/>
             <wp:cNvGraphicFramePr>
               <a:graphicFrameLocks noChangeAspect="1"/>
             </wp:cNvGraphicFramePr>
@@ -8347,7 +8646,7 @@
                     <pic:cNvPicPr/>
                   </pic:nvPicPr>
                   <pic:blipFill>
-                    <a:blip r:embed="rId23"/>
+                    <a:blip r:embed="rId26"/>
                     <a:stretch>
                       <a:fillRect/>
                     </a:stretch>
@@ -8378,7 +8677,7 @@
           <w:color w:val="7D8A9E"/>
           <w:sz w:val="20"/>
         </w:rPr>
-        <w:t>▲ ภาพที่ 12  สี่มิติที่ต้องตรงกับแผน</w:t>
+        <w:t>▲ ภาพที่ 15  สี่มิติที่ต้องตรงกับแผน</w:t>
       </w:r>
     </w:p>
     <w:p>
@@ -8496,8 +8795,8 @@
       <w:r>
         <w:drawing>
           <wp:inline xmlns:a="http://schemas.openxmlformats.org/drawingml/2006/main" xmlns:pic="http://schemas.openxmlformats.org/drawingml/2006/picture">
-            <wp:extent cx="5832000" cy="2988900"/>
-            <wp:docPr id="14" name="Picture 14"/>
+            <wp:extent cx="5832000" cy="3785768"/>
+            <wp:docPr id="17" name="Picture 17"/>
             <wp:cNvGraphicFramePr>
               <a:graphicFrameLocks noChangeAspect="1"/>
             </wp:cNvGraphicFramePr>
@@ -8505,11 +8804,11 @@
               <a:graphicData uri="http://schemas.openxmlformats.org/drawingml/2006/picture">
                 <pic:pic>
                   <pic:nvPicPr>
-                    <pic:cNvPr id="0" name="fig_dashboard.png"/>
+                    <pic:cNvPr id="0" name="Screenshot_bud_dashboard.png"/>
                     <pic:cNvPicPr/>
                   </pic:nvPicPr>
                   <pic:blipFill>
-                    <a:blip r:embed="rId24"/>
+                    <a:blip r:embed="rId27"/>
                     <a:stretch>
                       <a:fillRect/>
                     </a:stretch>
@@ -8517,7 +8816,7 @@
                   <pic:spPr>
                     <a:xfrm>
                       <a:off x="0" y="0"/>
-                      <a:ext cx="5832000" cy="2988900"/>
+                      <a:ext cx="5832000" cy="3785768"/>
                     </a:xfrm>
                     <a:prstGeom prst="rect"/>
                   </pic:spPr>
@@ -8540,7 +8839,76 @@
           <w:color w:val="7D8A9E"/>
           <w:sz w:val="20"/>
         </w:rPr>
-        <w:t>▲ ภาพที่ 13  ภาพรวมงบประมาณรายจ่ายประจำปี</w:t>
+        <w:t>▲ ภาพที่ 16  ติดตามงบประมาณประจำปี วงเงินจัดสรร เบิกจ่าย ก่อหนี้ผูกพัน และคงเหลือ</w:t>
+      </w:r>
+    </w:p>
+    <w:p>
+      <w:pPr>
+        <w:spacing w:after="40"/>
+        <w:jc w:val="center"/>
+      </w:pPr>
+      <w:r>
+        <w:drawing>
+          <wp:inline xmlns:a="http://schemas.openxmlformats.org/drawingml/2006/main" xmlns:pic="http://schemas.openxmlformats.org/drawingml/2006/picture">
+            <wp:extent cx="5832000" cy="4312901"/>
+            <wp:docPr id="18" name="Picture 18"/>
+            <wp:cNvGraphicFramePr>
+              <a:graphicFrameLocks noChangeAspect="1"/>
+            </wp:cNvGraphicFramePr>
+            <a:graphic>
+              <a:graphicData uri="http://schemas.openxmlformats.org/drawingml/2006/picture">
+                <pic:pic>
+                  <pic:nvPicPr>
+                    <pic:cNvPr id="0" name="Screenshot_bud_status.png"/>
+                    <pic:cNvPicPr/>
+                  </pic:nvPicPr>
+                  <pic:blipFill>
+                    <a:blip r:embed="rId28"/>
+                    <a:stretch>
+                      <a:fillRect/>
+                    </a:stretch>
+                  </pic:blipFill>
+                  <pic:spPr>
+                    <a:xfrm>
+                      <a:off x="0" y="0"/>
+                      <a:ext cx="5832000" cy="4312901"/>
+                    </a:xfrm>
+                    <a:prstGeom prst="rect"/>
+                  </pic:spPr>
+                </pic:pic>
+              </a:graphicData>
+            </a:graphic>
+          </wp:inline>
+        </w:drawing>
+      </w:r>
+    </w:p>
+    <w:p>
+      <w:pPr>
+        <w:spacing w:before="80" w:after="240"/>
+        <w:jc w:val="left"/>
+      </w:pPr>
+      <w:r>
+        <w:rPr>
+          <w:rFonts w:ascii="Prompt" w:hAnsi="Prompt" w:eastAsia="Prompt" w:cs="Prompt"/>
+          <w:b w:val="0"/>
+          <w:color w:val="7D8A9E"/>
+          <w:sz w:val="20"/>
+        </w:rPr>
+        <w:t>▲ ภาพที่ 17  สถานะคำของบประมาณ คิวคำขอและคำขออนุมัติล่าสุด</w:t>
+      </w:r>
+    </w:p>
+    <w:p>
+      <w:pPr>
+        <w:spacing w:after="160" w:line="276" w:lineRule="auto"/>
+      </w:pPr>
+      <w:r>
+        <w:rPr>
+          <w:rFonts w:ascii="Prompt" w:hAnsi="Prompt" w:eastAsia="Prompt" w:cs="Prompt"/>
+          <w:b w:val="0"/>
+          <w:color w:val="2A333A"/>
+          <w:sz w:val="24"/>
+        </w:rPr>
+        <w:t>หน้าติดตามงบประมาณประจำปีเลื่อนลงต่อได้ เพื่อดูงบตามประเภทรายจ่าย โครงการลงทุน และรายการที่ต้องเร่งดำเนินการ หน้าสถานะคำของบประมาณใช้ติดตามคิวคำขอ หัวข้อในหน้านี้ยังเขียนว่า ภาพรวมงบประมาณรายจ่ายประจำปี แต่ชื่อเมนูที่กดเข้าคือ สถานะคำของบประมาณ</w:t>
       </w:r>
     </w:p>
     <w:tbl>
@@ -8686,7 +9054,7 @@
                 <w:color w:val="2A333A"/>
                 <w:sz w:val="22"/>
               </w:rPr>
-              <w:t>ภาพรวมงบประมาณรายจ่ายประจำปี</w:t>
+              <w:t>ติดตามงบประมาณประจำปี</w:t>
             </w:r>
           </w:p>
         </w:tc>
@@ -8719,7 +9087,7 @@
                 <w:color w:val="2A333A"/>
                 <w:sz w:val="22"/>
               </w:rPr>
-              <w:t>ยอดจัดสรร ใช้จริง คงเหลือ และสัดส่วนตามแบบฟอร์ม</w:t>
+              <w:t>จัดสรร เบิกจ่าย ก่อหนี้ผูกพัน คงเหลือ กราฟเทียบแผน และผลตามหน่วยงาน</w:t>
             </w:r>
           </w:p>
         </w:tc>
@@ -8921,7 +9289,7 @@
                 <w:color w:val="2A333A"/>
                 <w:sz w:val="22"/>
               </w:rPr>
-              <w:t>คิวคำขอตามสถานะ</w:t>
+              <w:t>คิวคำขอตามสถานะ และคำขอล่าสุด</w:t>
             </w:r>
           </w:p>
         </w:tc>
@@ -9142,7 +9510,7 @@
         <w:drawing>
           <wp:inline xmlns:a="http://schemas.openxmlformats.org/drawingml/2006/main" xmlns:pic="http://schemas.openxmlformats.org/drawingml/2006/picture">
             <wp:extent cx="5832000" cy="2332800"/>
-            <wp:docPr id="15" name="Picture 15"/>
+            <wp:docPr id="19" name="Picture 19"/>
             <wp:cNvGraphicFramePr>
               <a:graphicFrameLocks noChangeAspect="1"/>
             </wp:cNvGraphicFramePr>
@@ -9154,7 +9522,7 @@
                     <pic:cNvPicPr/>
                   </pic:nvPicPr>
                   <pic:blipFill>
-                    <a:blip r:embed="rId25"/>
+                    <a:blip r:embed="rId29"/>
                     <a:stretch>
                       <a:fillRect/>
                     </a:stretch>
@@ -9185,7 +9553,7 @@
           <w:color w:val="7D8A9E"/>
           <w:sz w:val="20"/>
         </w:rPr>
-        <w:t>▲ ภาพที่ 14  สิ่งที่ควรทำและไม่ควรทำ</w:t>
+        <w:t>▲ ภาพที่ 18  สิ่งที่ควรทำและไม่ควรทำ</w:t>
       </w:r>
     </w:p>
     <w:tbl>
@@ -10553,7 +10921,7 @@
                 <w:color w:val="2A333A"/>
                 <w:sz w:val="22"/>
               </w:rPr>
-              <w:t>สถานะ ส่งงานงบ</w:t>
+              <w:t>สถานะ ส่งหน่วยงบประมาณ</w:t>
             </w:r>
           </w:p>
         </w:tc>
@@ -12577,7 +12945,7 @@
           <w:color w:val="7D8A9E"/>
           <w:sz w:val="22"/>
         </w:rPr>
-        <w:t>โรงพยาบาลวชิระภูเก็ต  ·  ระบบงบประมาณบน Odoo 18  ·  เวอร์ชันเอกสาร 1.0</w:t>
+        <w:t>โรงพยาบาลวชิระภูเก็ต  ·  ระบบงบประมาณบน Odoo 18  ·  เวอร์ชันเอกสาร 1.1</w:t>
       </w:r>
     </w:p>
     <w:sectPr>

</xml_diff>